<commit_message>
fix docx image placeholder tags
</commit_message>
<xml_diff>
--- a/public/template.docx
+++ b/public/template.docx
@@ -1201,7 +1201,7 @@
     </w:p>
     <w:p>
       <w:r>
-        <w:t>{#coord1_sig_image}{%coord1_sig_image}{/coord1_sig_image}                        {#coord2_sig_image}{%coord2_sig_image}{/coord2_sig_image}</w:t>
+        <w:t>{#coord1_sig_image}{coord1_sig_image}{/coord1_sig_image}                        {#coord2_sig_image}{coord2_sig_image}{/coord2_sig_image}</w:t>
       </w:r>
     </w:p>
     <w:p>
@@ -1336,7 +1336,7 @@
         <w:jc w:val="center"/>
       </w:pPr>
       <w:r>
-        <w:t>{%brochure_img}</w:t>
+        <w:t>{brochure_img}</w:t>
       </w:r>
     </w:p>
     <w:p>
@@ -1523,7 +1523,7 @@
     </w:p>
     <w:p>
       <w:r>
-        <w:t>{%img}</w:t>
+        <w:t>{img}</w:t>
       </w:r>
     </w:p>
     <w:p>
@@ -2222,7 +2222,7 @@
     </w:p>
     <w:p>
       <w:r>
-        <w:t>{#coord1_sig_image}{%coord1_sig_image}{/coord1_sig_image}                        {#coord2_sig_image}{%coord2_sig_image}{/coord2_sig_image}</w:t>
+        <w:t>{#coord1_sig_image}{coord1_sig_image}{/coord1_sig_image}                        {#coord2_sig_image}{coord2_sig_image}{/coord2_sig_image}</w:t>
       </w:r>
     </w:p>
     <w:p>
@@ -2571,7 +2571,7 @@
     </w:p>
     <w:p>
       <w:r>
-        <w:t>{#coord1_sig_image}{%coord1_sig_image}{/coord1_sig_image}                        {#coord2_sig_image}{%coord2_sig_image}{/coord2_sig_image}</w:t>
+        <w:t>{#coord1_sig_image}{coord1_sig_image}{/coord1_sig_image}                        {#coord2_sig_image}{coord2_sig_image}{/coord2_sig_image}</w:t>
       </w:r>
     </w:p>
     <w:p>

</xml_diff>

<commit_message>
Implement theme toggle, polish UI, restructure routing
</commit_message>
<xml_diff>
--- a/public/template.docx
+++ b/public/template.docx
@@ -1769,7 +1769,6 @@
         <w:gridCol w:w="993"/>
         <w:gridCol w:w="1733"/>
         <w:gridCol w:w="4078"/>
-        <w:gridCol w:w="1985"/>
         <w:gridCol w:w="1843"/>
         <w:tblGridChange w:id="0">
           <w:tblGrid>
@@ -2011,14 +2010,9 @@
                 <w:vertAlign w:val="baseline"/>
                 <w:rtl w:val="0"/>
               </w:rPr>
-              <w:t xml:space="preserve">Signature</w:t>
-            </w:r>
-          </w:p>
-        </w:tc>
-        <w:tc>
-          <w:tcPr>
-            <w:vAlign w:val="center"/>
-          </w:tcPr>
+              <w:t xml:space="preserve">Student (S) /</w:t>
+            </w:r>
+          </w:p>
           <w:p>
             <w:pPr>
               <w:keepNext w:val="0"/>
@@ -2068,58 +2062,6 @@
                 <w:vertAlign w:val="baseline"/>
                 <w:rtl w:val="0"/>
               </w:rPr>
-              <w:t xml:space="preserve">Student (S) /</w:t>
-            </w:r>
-          </w:p>
-          <w:p>
-            <w:pPr>
-              <w:keepNext w:val="0"/>
-              <w:keepLines w:val="0"/>
-              <w:widowControl w:val="1"/>
-              <w:pBdr>
-                <w:top w:space="0" w:sz="0" w:val="nil"/>
-                <w:left w:space="0" w:sz="0" w:val="nil"/>
-                <w:bottom w:space="0" w:sz="0" w:val="nil"/>
-                <w:right w:space="0" w:sz="0" w:val="nil"/>
-                <w:between w:space="0" w:sz="0" w:val="nil"/>
-              </w:pBdr>
-              <w:shd w:fill="auto" w:val="clear"/>
-              <w:spacing w:after="0" w:before="0" w:line="240" w:lineRule="auto"/>
-              <w:ind w:left="0" w:right="0" w:firstLine="0"/>
-              <w:jc w:val="center"/>
-              <w:rPr>
-                <w:rFonts w:ascii="Times New Roman" w:cs="Times New Roman" w:eastAsia="Times New Roman" w:hAnsi="Times New Roman"/>
-                <w:b w:val="1"/>
-                <w:bCs w:val="1"/>
-                <w:i w:val="0"/>
-                <w:iCs w:val="0"/>
-                <w:smallCaps w:val="0"/>
-                <w:strike w:val="0"/>
-                <w:color w:val="000000"/>
-                <w:sz w:val="22"/>
-                <w:szCs w:val="22"/>
-                <w:u w:val="none"/>
-                <w:shd w:fill="auto" w:val="clear"/>
-                <w:vertAlign w:val="baseline"/>
-              </w:rPr>
-            </w:pPr>
-            <w:r>
-              <w:rPr>
-                <w:rFonts w:ascii="Times New Roman" w:cs="Times New Roman" w:eastAsia="Times New Roman" w:hAnsi="Times New Roman"/>
-                <w:b w:val="1"/>
-                <w:bCs w:val="1"/>
-                <w:i w:val="0"/>
-                <w:iCs w:val="0"/>
-                <w:smallCaps w:val="0"/>
-                <w:strike w:val="0"/>
-                <w:color w:val="000000"/>
-                <w:sz w:val="22"/>
-                <w:szCs w:val="22"/>
-                <w:u w:val="none"/>
-                <w:shd w:fill="auto" w:val="clear"/>
-                <w:vertAlign w:val="baseline"/>
-                <w:rtl w:val="0"/>
-              </w:rPr>
               <w:t xml:space="preserve">Faculty(F) / External Participants (E)</w:t>
             </w:r>
           </w:p>
@@ -2173,21 +2115,6 @@
             </w:pPr>
             <w:r>
               <w:t>{name}</w:t>
-            </w:r>
-          </w:p>
-        </w:tc>
-        <w:tc>
-          <w:tcPr/>
-          <w:p>
-            <w:pPr>
-              <w:spacing w:line="480" w:lineRule="auto"/>
-              <w:jc w:val="center"/>
-              <w:rPr>
-                <w:rFonts w:ascii="Times New Roman" w:cs="Times New Roman" w:eastAsia="Times New Roman" w:hAnsi="Times New Roman"/>
-              </w:rPr>
-            </w:pPr>
-            <w:r>
-              <w:t/>
             </w:r>
           </w:p>
         </w:tc>

</xml_diff>